<commit_message>
[docx] PLII_M01: hang khuon ds_nganh them {_stt} + {la_nganh_chinh} cot 3 (nganh chinh theo template phap ly); spec ds_nganh_nghe bat stt_tag; siết acceptance test assert STT 1/2/3 + dung mot dau X, khong con token sot
</commit_message>
<xml_diff>
--- a/app/templates/PLII_M01.docx
+++ b/app/templates/PLII_M01.docx
@@ -854,15 +854,9 @@
           <w:tcPr>
             <w:tcW w:type="dxa" w:w="2160"/>
           </w:tcPr>
-          <w:p/>
-        </w:tc>
-        <w:tc>
-          <w:tcPr>
-            <w:tcW w:type="dxa" w:w="2160"/>
-          </w:tcPr>
           <w:p>
             <w:r>
-              <w:t>{#ds_nganh}{ten_nganh}</w:t>
+              <w:t>{#ds_nganh}{_stt}</w:t>
             </w:r>
           </w:p>
         </w:tc>
@@ -872,7 +866,7 @@
           </w:tcPr>
           <w:p>
             <w:r>
-              <w:t>{ma_nganh}{/ds_nganh}</w:t>
+              <w:t>{ten_nganh}</w:t>
             </w:r>
           </w:p>
         </w:tc>
@@ -880,7 +874,21 @@
           <w:tcPr>
             <w:tcW w:type="dxa" w:w="2160"/>
           </w:tcPr>
-          <w:p/>
+          <w:p>
+            <w:r>
+              <w:t>{ma_nganh}</w:t>
+            </w:r>
+          </w:p>
+        </w:tc>
+        <w:tc>
+          <w:tcPr>
+            <w:tcW w:type="dxa" w:w="2160"/>
+          </w:tcPr>
+          <w:p>
+            <w:r>
+              <w:t>{la_nganh_chinh}{/ds_nganh}</w:t>
+            </w:r>
+          </w:p>
         </w:tc>
       </w:tr>
     </w:tbl>

</xml_diff>

<commit_message>
integrate P1-D/E: regen template PLII_M01 (stt_tag ds_tv_ho_gia_dinh) trong allowlist + go defect plii_m01_stt da fix khoi census + don nhan EFPI loi thoi o test_industry_change (giu nguyen assertion)
</commit_message>
<xml_diff>
--- a/app/templates/PLII_M01.docx
+++ b/app/templates/PLII_M01.docx
@@ -1772,15 +1772,19 @@
           <w:tcPr>
             <w:tcW w:type="dxa" w:w="864"/>
           </w:tcPr>
-          <w:p/>
-        </w:tc>
-        <w:tc>
-          <w:tcPr>
-            <w:tcW w:type="dxa" w:w="864"/>
-          </w:tcPr>
           <w:p>
             <w:r>
-              <w:t>{#ds_tv_ho_gia_dinh}{ho_ten}</w:t>
+              <w:t>{#ds_tv_ho_gia_dinh}{_stt}</w:t>
+            </w:r>
+          </w:p>
+        </w:tc>
+        <w:tc>
+          <w:tcPr>
+            <w:tcW w:type="dxa" w:w="864"/>
+          </w:tcPr>
+          <w:p>
+            <w:r>
+              <w:t>{ho_ten}</w:t>
             </w:r>
           </w:p>
         </w:tc>

</xml_diff>

<commit_message>
fix(5R-laneD): xử lý 3 finding auditor độc lập
- F1: _drop_trailing_empty_para giữ lại span sectPr cuối (bug 61c8068 cắt
  mất sectPr trên path render sparse) — test_phase5r_metadata 15/15
- F2: regen khớp committed — first-wins + SOURCE_OVERRIDES skip alias trong
  full-run; _find_output_grid_block + verify_output_table_spec nhận bảng ký
  NGANG 1x2 (M70); form_maps path alias chuẩn hóa (M28/M29/M55/M57);
  regen 11 template width_policy (bảng rộng phân bổ theo nội dung, sàn 567);
  cellLabel output-table trải nhãn theo cột khi len(labels)==cols;
  FORM_TABLE_CONTRACTS M70 sync 1x2; test_output_table/runtime_tables/
  wiring_gate rebaseline theo layout ngang (2 vai trò ký + >=2 ô)
- F1 khuyến nghị: đăng ký 3 suite 5R vào release_runner (54→57)
- rebaseline WIDE_TABLE_FIXTURE + policies min_col 567 (census thực tế)
</commit_message>
<xml_diff>
--- a/app/templates/PLII_M01.docx
+++ b/app/templates/PLII_M01.docx
@@ -1376,21 +1376,21 @@
         </w:tblBorders>
       </w:tblPr>
       <w:tblGrid>
-        <w:gridCol w:w="864"/>
-        <w:gridCol w:w="864"/>
-        <w:gridCol w:w="864"/>
-        <w:gridCol w:w="864"/>
-        <w:gridCol w:w="864"/>
-        <w:gridCol w:w="864"/>
-        <w:gridCol w:w="864"/>
-        <w:gridCol w:w="864"/>
-        <w:gridCol w:w="864"/>
-        <w:gridCol w:w="864"/>
+        <w:gridCol w:w="567"/>
+        <w:gridCol w:w="567"/>
+        <w:gridCol w:w="1572"/>
+        <w:gridCol w:w="1494"/>
+        <w:gridCol w:w="630"/>
+        <w:gridCol w:w="630"/>
+        <w:gridCol w:w="567"/>
+        <w:gridCol w:w="1023"/>
+        <w:gridCol w:w="1023"/>
+        <w:gridCol w:w="567"/>
       </w:tblGrid>
       <w:tr>
         <w:tc>
           <w:tcPr>
-            <w:tcW w:type="dxa" w:w="864"/>
+            <w:tcW w:type="dxa" w:w="567"/>
           </w:tcPr>
           <w:p>
             <w:r>
@@ -1403,7 +1403,7 @@
         </w:tc>
         <w:tc>
           <w:tcPr>
-            <w:tcW w:type="dxa" w:w="864"/>
+            <w:tcW w:type="dxa" w:w="567"/>
           </w:tcPr>
           <w:p>
             <w:r>
@@ -1416,7 +1416,7 @@
         </w:tc>
         <w:tc>
           <w:tcPr>
-            <w:tcW w:type="dxa" w:w="864"/>
+            <w:tcW w:type="dxa" w:w="1572"/>
           </w:tcPr>
           <w:p>
             <w:r>
@@ -1429,7 +1429,7 @@
         </w:tc>
         <w:tc>
           <w:tcPr>
-            <w:tcW w:type="dxa" w:w="864"/>
+            <w:tcW w:type="dxa" w:w="1494"/>
           </w:tcPr>
           <w:p>
             <w:r>
@@ -1442,7 +1442,7 @@
         </w:tc>
         <w:tc>
           <w:tcPr>
-            <w:tcW w:type="dxa" w:w="864"/>
+            <w:tcW w:type="dxa" w:w="630"/>
           </w:tcPr>
           <w:p>
             <w:r>
@@ -1455,7 +1455,7 @@
         </w:tc>
         <w:tc>
           <w:tcPr>
-            <w:tcW w:type="dxa" w:w="864"/>
+            <w:tcW w:type="dxa" w:w="630"/>
           </w:tcPr>
           <w:p>
             <w:r>
@@ -1468,7 +1468,7 @@
         </w:tc>
         <w:tc>
           <w:tcPr>
-            <w:tcW w:type="dxa" w:w="864"/>
+            <w:tcW w:type="dxa" w:w="567"/>
           </w:tcPr>
           <w:p>
             <w:r>
@@ -1481,7 +1481,7 @@
         </w:tc>
         <w:tc>
           <w:tcPr>
-            <w:tcW w:type="dxa" w:w="864"/>
+            <w:tcW w:type="dxa" w:w="1023"/>
           </w:tcPr>
           <w:p>
             <w:r>
@@ -1494,7 +1494,7 @@
         </w:tc>
         <w:tc>
           <w:tcPr>
-            <w:tcW w:type="dxa" w:w="864"/>
+            <w:tcW w:type="dxa" w:w="1023"/>
           </w:tcPr>
           <w:p>
             <w:r>
@@ -1507,7 +1507,7 @@
         </w:tc>
         <w:tc>
           <w:tcPr>
-            <w:tcW w:type="dxa" w:w="864"/>
+            <w:tcW w:type="dxa" w:w="567"/>
           </w:tcPr>
           <w:p>
             <w:r>
@@ -1522,61 +1522,61 @@
       <w:tr>
         <w:tc>
           <w:tcPr>
-            <w:tcW w:type="dxa" w:w="864"/>
-          </w:tcPr>
-          <w:p/>
-        </w:tc>
-        <w:tc>
-          <w:tcPr>
-            <w:tcW w:type="dxa" w:w="864"/>
-          </w:tcPr>
-          <w:p/>
-        </w:tc>
-        <w:tc>
-          <w:tcPr>
-            <w:tcW w:type="dxa" w:w="864"/>
-          </w:tcPr>
-          <w:p/>
-        </w:tc>
-        <w:tc>
-          <w:tcPr>
-            <w:tcW w:type="dxa" w:w="864"/>
-          </w:tcPr>
-          <w:p/>
-        </w:tc>
-        <w:tc>
-          <w:tcPr>
-            <w:tcW w:type="dxa" w:w="864"/>
-          </w:tcPr>
-          <w:p/>
-        </w:tc>
-        <w:tc>
-          <w:tcPr>
-            <w:tcW w:type="dxa" w:w="864"/>
-          </w:tcPr>
-          <w:p/>
-        </w:tc>
-        <w:tc>
-          <w:tcPr>
-            <w:tcW w:type="dxa" w:w="864"/>
-          </w:tcPr>
-          <w:p/>
-        </w:tc>
-        <w:tc>
-          <w:tcPr>
-            <w:tcW w:type="dxa" w:w="864"/>
-          </w:tcPr>
-          <w:p/>
-        </w:tc>
-        <w:tc>
-          <w:tcPr>
-            <w:tcW w:type="dxa" w:w="864"/>
-          </w:tcPr>
-          <w:p/>
-        </w:tc>
-        <w:tc>
-          <w:tcPr>
-            <w:tcW w:type="dxa" w:w="864"/>
+            <w:tcW w:type="dxa" w:w="567"/>
+          </w:tcPr>
+          <w:p/>
+        </w:tc>
+        <w:tc>
+          <w:tcPr>
+            <w:tcW w:type="dxa" w:w="567"/>
+          </w:tcPr>
+          <w:p/>
+        </w:tc>
+        <w:tc>
+          <w:tcPr>
+            <w:tcW w:type="dxa" w:w="1572"/>
+          </w:tcPr>
+          <w:p/>
+        </w:tc>
+        <w:tc>
+          <w:tcPr>
+            <w:tcW w:type="dxa" w:w="1494"/>
+          </w:tcPr>
+          <w:p/>
+        </w:tc>
+        <w:tc>
+          <w:tcPr>
+            <w:tcW w:type="dxa" w:w="630"/>
+          </w:tcPr>
+          <w:p/>
+        </w:tc>
+        <w:tc>
+          <w:tcPr>
+            <w:tcW w:type="dxa" w:w="630"/>
+          </w:tcPr>
+          <w:p/>
+        </w:tc>
+        <w:tc>
+          <w:tcPr>
+            <w:tcW w:type="dxa" w:w="567"/>
+          </w:tcPr>
+          <w:p/>
+        </w:tc>
+        <w:tc>
+          <w:tcPr>
+            <w:tcW w:type="dxa" w:w="1023"/>
+          </w:tcPr>
+          <w:p/>
+        </w:tc>
+        <w:tc>
+          <w:tcPr>
+            <w:tcW w:type="dxa" w:w="1023"/>
+          </w:tcPr>
+          <w:p/>
+        </w:tc>
+        <w:tc>
+          <w:tcPr>
+            <w:tcW w:type="dxa" w:w="567"/>
           </w:tcPr>
           <w:p/>
         </w:tc>
@@ -1584,61 +1584,61 @@
       <w:tr>
         <w:tc>
           <w:tcPr>
-            <w:tcW w:type="dxa" w:w="864"/>
-          </w:tcPr>
-          <w:p/>
-        </w:tc>
-        <w:tc>
-          <w:tcPr>
-            <w:tcW w:type="dxa" w:w="864"/>
-          </w:tcPr>
-          <w:p/>
-        </w:tc>
-        <w:tc>
-          <w:tcPr>
-            <w:tcW w:type="dxa" w:w="864"/>
-          </w:tcPr>
-          <w:p/>
-        </w:tc>
-        <w:tc>
-          <w:tcPr>
-            <w:tcW w:type="dxa" w:w="864"/>
-          </w:tcPr>
-          <w:p/>
-        </w:tc>
-        <w:tc>
-          <w:tcPr>
-            <w:tcW w:type="dxa" w:w="864"/>
-          </w:tcPr>
-          <w:p/>
-        </w:tc>
-        <w:tc>
-          <w:tcPr>
-            <w:tcW w:type="dxa" w:w="864"/>
-          </w:tcPr>
-          <w:p/>
-        </w:tc>
-        <w:tc>
-          <w:tcPr>
-            <w:tcW w:type="dxa" w:w="864"/>
-          </w:tcPr>
-          <w:p/>
-        </w:tc>
-        <w:tc>
-          <w:tcPr>
-            <w:tcW w:type="dxa" w:w="864"/>
-          </w:tcPr>
-          <w:p/>
-        </w:tc>
-        <w:tc>
-          <w:tcPr>
-            <w:tcW w:type="dxa" w:w="864"/>
-          </w:tcPr>
-          <w:p/>
-        </w:tc>
-        <w:tc>
-          <w:tcPr>
-            <w:tcW w:type="dxa" w:w="864"/>
+            <w:tcW w:type="dxa" w:w="567"/>
+          </w:tcPr>
+          <w:p/>
+        </w:tc>
+        <w:tc>
+          <w:tcPr>
+            <w:tcW w:type="dxa" w:w="567"/>
+          </w:tcPr>
+          <w:p/>
+        </w:tc>
+        <w:tc>
+          <w:tcPr>
+            <w:tcW w:type="dxa" w:w="1572"/>
+          </w:tcPr>
+          <w:p/>
+        </w:tc>
+        <w:tc>
+          <w:tcPr>
+            <w:tcW w:type="dxa" w:w="1494"/>
+          </w:tcPr>
+          <w:p/>
+        </w:tc>
+        <w:tc>
+          <w:tcPr>
+            <w:tcW w:type="dxa" w:w="630"/>
+          </w:tcPr>
+          <w:p/>
+        </w:tc>
+        <w:tc>
+          <w:tcPr>
+            <w:tcW w:type="dxa" w:w="630"/>
+          </w:tcPr>
+          <w:p/>
+        </w:tc>
+        <w:tc>
+          <w:tcPr>
+            <w:tcW w:type="dxa" w:w="567"/>
+          </w:tcPr>
+          <w:p/>
+        </w:tc>
+        <w:tc>
+          <w:tcPr>
+            <w:tcW w:type="dxa" w:w="1023"/>
+          </w:tcPr>
+          <w:p/>
+        </w:tc>
+        <w:tc>
+          <w:tcPr>
+            <w:tcW w:type="dxa" w:w="1023"/>
+          </w:tcPr>
+          <w:p/>
+        </w:tc>
+        <w:tc>
+          <w:tcPr>
+            <w:tcW w:type="dxa" w:w="567"/>
           </w:tcPr>
           <w:p/>
         </w:tc>
@@ -1646,61 +1646,61 @@
       <w:tr>
         <w:tc>
           <w:tcPr>
-            <w:tcW w:type="dxa" w:w="864"/>
-          </w:tcPr>
-          <w:p/>
-        </w:tc>
-        <w:tc>
-          <w:tcPr>
-            <w:tcW w:type="dxa" w:w="864"/>
-          </w:tcPr>
-          <w:p/>
-        </w:tc>
-        <w:tc>
-          <w:tcPr>
-            <w:tcW w:type="dxa" w:w="864"/>
-          </w:tcPr>
-          <w:p/>
-        </w:tc>
-        <w:tc>
-          <w:tcPr>
-            <w:tcW w:type="dxa" w:w="864"/>
-          </w:tcPr>
-          <w:p/>
-        </w:tc>
-        <w:tc>
-          <w:tcPr>
-            <w:tcW w:type="dxa" w:w="864"/>
-          </w:tcPr>
-          <w:p/>
-        </w:tc>
-        <w:tc>
-          <w:tcPr>
-            <w:tcW w:type="dxa" w:w="864"/>
-          </w:tcPr>
-          <w:p/>
-        </w:tc>
-        <w:tc>
-          <w:tcPr>
-            <w:tcW w:type="dxa" w:w="864"/>
-          </w:tcPr>
-          <w:p/>
-        </w:tc>
-        <w:tc>
-          <w:tcPr>
-            <w:tcW w:type="dxa" w:w="864"/>
-          </w:tcPr>
-          <w:p/>
-        </w:tc>
-        <w:tc>
-          <w:tcPr>
-            <w:tcW w:type="dxa" w:w="864"/>
-          </w:tcPr>
-          <w:p/>
-        </w:tc>
-        <w:tc>
-          <w:tcPr>
-            <w:tcW w:type="dxa" w:w="864"/>
+            <w:tcW w:type="dxa" w:w="567"/>
+          </w:tcPr>
+          <w:p/>
+        </w:tc>
+        <w:tc>
+          <w:tcPr>
+            <w:tcW w:type="dxa" w:w="567"/>
+          </w:tcPr>
+          <w:p/>
+        </w:tc>
+        <w:tc>
+          <w:tcPr>
+            <w:tcW w:type="dxa" w:w="1572"/>
+          </w:tcPr>
+          <w:p/>
+        </w:tc>
+        <w:tc>
+          <w:tcPr>
+            <w:tcW w:type="dxa" w:w="1494"/>
+          </w:tcPr>
+          <w:p/>
+        </w:tc>
+        <w:tc>
+          <w:tcPr>
+            <w:tcW w:type="dxa" w:w="630"/>
+          </w:tcPr>
+          <w:p/>
+        </w:tc>
+        <w:tc>
+          <w:tcPr>
+            <w:tcW w:type="dxa" w:w="630"/>
+          </w:tcPr>
+          <w:p/>
+        </w:tc>
+        <w:tc>
+          <w:tcPr>
+            <w:tcW w:type="dxa" w:w="567"/>
+          </w:tcPr>
+          <w:p/>
+        </w:tc>
+        <w:tc>
+          <w:tcPr>
+            <w:tcW w:type="dxa" w:w="1023"/>
+          </w:tcPr>
+          <w:p/>
+        </w:tc>
+        <w:tc>
+          <w:tcPr>
+            <w:tcW w:type="dxa" w:w="1023"/>
+          </w:tcPr>
+          <w:p/>
+        </w:tc>
+        <w:tc>
+          <w:tcPr>
+            <w:tcW w:type="dxa" w:w="567"/>
           </w:tcPr>
           <w:p/>
         </w:tc>
@@ -1708,61 +1708,61 @@
       <w:tr>
         <w:tc>
           <w:tcPr>
-            <w:tcW w:type="dxa" w:w="864"/>
-          </w:tcPr>
-          <w:p/>
-        </w:tc>
-        <w:tc>
-          <w:tcPr>
-            <w:tcW w:type="dxa" w:w="864"/>
-          </w:tcPr>
-          <w:p/>
-        </w:tc>
-        <w:tc>
-          <w:tcPr>
-            <w:tcW w:type="dxa" w:w="864"/>
-          </w:tcPr>
-          <w:p/>
-        </w:tc>
-        <w:tc>
-          <w:tcPr>
-            <w:tcW w:type="dxa" w:w="864"/>
-          </w:tcPr>
-          <w:p/>
-        </w:tc>
-        <w:tc>
-          <w:tcPr>
-            <w:tcW w:type="dxa" w:w="864"/>
-          </w:tcPr>
-          <w:p/>
-        </w:tc>
-        <w:tc>
-          <w:tcPr>
-            <w:tcW w:type="dxa" w:w="864"/>
-          </w:tcPr>
-          <w:p/>
-        </w:tc>
-        <w:tc>
-          <w:tcPr>
-            <w:tcW w:type="dxa" w:w="864"/>
-          </w:tcPr>
-          <w:p/>
-        </w:tc>
-        <w:tc>
-          <w:tcPr>
-            <w:tcW w:type="dxa" w:w="864"/>
-          </w:tcPr>
-          <w:p/>
-        </w:tc>
-        <w:tc>
-          <w:tcPr>
-            <w:tcW w:type="dxa" w:w="864"/>
-          </w:tcPr>
-          <w:p/>
-        </w:tc>
-        <w:tc>
-          <w:tcPr>
-            <w:tcW w:type="dxa" w:w="864"/>
+            <w:tcW w:type="dxa" w:w="567"/>
+          </w:tcPr>
+          <w:p/>
+        </w:tc>
+        <w:tc>
+          <w:tcPr>
+            <w:tcW w:type="dxa" w:w="567"/>
+          </w:tcPr>
+          <w:p/>
+        </w:tc>
+        <w:tc>
+          <w:tcPr>
+            <w:tcW w:type="dxa" w:w="1572"/>
+          </w:tcPr>
+          <w:p/>
+        </w:tc>
+        <w:tc>
+          <w:tcPr>
+            <w:tcW w:type="dxa" w:w="1494"/>
+          </w:tcPr>
+          <w:p/>
+        </w:tc>
+        <w:tc>
+          <w:tcPr>
+            <w:tcW w:type="dxa" w:w="630"/>
+          </w:tcPr>
+          <w:p/>
+        </w:tc>
+        <w:tc>
+          <w:tcPr>
+            <w:tcW w:type="dxa" w:w="630"/>
+          </w:tcPr>
+          <w:p/>
+        </w:tc>
+        <w:tc>
+          <w:tcPr>
+            <w:tcW w:type="dxa" w:w="567"/>
+          </w:tcPr>
+          <w:p/>
+        </w:tc>
+        <w:tc>
+          <w:tcPr>
+            <w:tcW w:type="dxa" w:w="1023"/>
+          </w:tcPr>
+          <w:p/>
+        </w:tc>
+        <w:tc>
+          <w:tcPr>
+            <w:tcW w:type="dxa" w:w="1023"/>
+          </w:tcPr>
+          <w:p/>
+        </w:tc>
+        <w:tc>
+          <w:tcPr>
+            <w:tcW w:type="dxa" w:w="567"/>
           </w:tcPr>
           <w:p/>
         </w:tc>
@@ -1770,7 +1770,7 @@
       <w:tr>
         <w:tc>
           <w:tcPr>
-            <w:tcW w:type="dxa" w:w="864"/>
+            <w:tcW w:type="dxa" w:w="567"/>
           </w:tcPr>
           <w:p>
             <w:r>
@@ -1780,7 +1780,7 @@
         </w:tc>
         <w:tc>
           <w:tcPr>
-            <w:tcW w:type="dxa" w:w="864"/>
+            <w:tcW w:type="dxa" w:w="567"/>
           </w:tcPr>
           <w:p>
             <w:r>
@@ -1790,7 +1790,7 @@
         </w:tc>
         <w:tc>
           <w:tcPr>
-            <w:tcW w:type="dxa" w:w="864"/>
+            <w:tcW w:type="dxa" w:w="1572"/>
           </w:tcPr>
           <w:p>
             <w:r>
@@ -1800,7 +1800,7 @@
         </w:tc>
         <w:tc>
           <w:tcPr>
-            <w:tcW w:type="dxa" w:w="864"/>
+            <w:tcW w:type="dxa" w:w="1494"/>
           </w:tcPr>
           <w:p>
             <w:r>
@@ -1810,7 +1810,7 @@
         </w:tc>
         <w:tc>
           <w:tcPr>
-            <w:tcW w:type="dxa" w:w="864"/>
+            <w:tcW w:type="dxa" w:w="630"/>
           </w:tcPr>
           <w:p>
             <w:r>
@@ -1820,7 +1820,7 @@
         </w:tc>
         <w:tc>
           <w:tcPr>
-            <w:tcW w:type="dxa" w:w="864"/>
+            <w:tcW w:type="dxa" w:w="630"/>
           </w:tcPr>
           <w:p>
             <w:r>
@@ -1830,7 +1830,7 @@
         </w:tc>
         <w:tc>
           <w:tcPr>
-            <w:tcW w:type="dxa" w:w="864"/>
+            <w:tcW w:type="dxa" w:w="567"/>
           </w:tcPr>
           <w:p>
             <w:r>
@@ -1840,7 +1840,7 @@
         </w:tc>
         <w:tc>
           <w:tcPr>
-            <w:tcW w:type="dxa" w:w="864"/>
+            <w:tcW w:type="dxa" w:w="1023"/>
           </w:tcPr>
           <w:p>
             <w:r>
@@ -1850,7 +1850,7 @@
         </w:tc>
         <w:tc>
           <w:tcPr>
-            <w:tcW w:type="dxa" w:w="864"/>
+            <w:tcW w:type="dxa" w:w="1023"/>
           </w:tcPr>
           <w:p>
             <w:r>
@@ -1860,7 +1860,7 @@
         </w:tc>
         <w:tc>
           <w:tcPr>
-            <w:tcW w:type="dxa" w:w="864"/>
+            <w:tcW w:type="dxa" w:w="567"/>
           </w:tcPr>
           <w:p>
             <w:r>

</xml_diff>

<commit_message>
6V-V4b(7): fixture ngày đủ định dạng dd/mm/yyyy + cột chữ ký handwriting-only
(a) 'ngay_sinh'/'ngay_cap' -> TRƯỜNG NGÀY ĐỦ ('15/07/1982' / ngày cấp 20xx)
    thay vì chỉ số ngày ('Ngày, tháng, năm sinh: 12', 'Ngày cấp 10' —
    adjudicate auditor Finding #4). Các trường thành phần (ngay_ky, ngày/
    tháng/năm băng quốc hiệu) giữ giá trị thành phần.
(b) cột 'Chữ ký' (tag chu_ky, 9 bảng thành viên/cổ đông PLII_M01/M02,
    PLI_M02/06/07/08/09/12/15) KHÔNG nhận dữ liệu fixture — vùng viết tay
    theo bản giấy; policy is_handwriting_column() trong phase5_fixtures
    (phần bảng của handwriting-only; registry phase6v_handwriting_slots
    và D14 slot-tiêu đề giữ nguyên, không đổi). D12 giữ phân biệt các
    field còn lại — selftest fixtures 437 PASS.
Kèm regen templates/blocks/tag M72: sàn longest-word của cột ngày được
tính lại trên giá trị ngày đầy đủ mới (cùng commit vì floors sample
ValueFactory lúc regen).
</commit_message>
<xml_diff>
--- a/app/templates/PLII_M01.docx
+++ b/app/templates/PLII_M01.docx
@@ -1390,21 +1390,21 @@
         </w:tblBorders>
       </w:tblPr>
       <w:tblGrid>
-        <w:gridCol w:w="975"/>
-        <w:gridCol w:w="1409"/>
-        <w:gridCol w:w="1393"/>
-        <w:gridCol w:w="2379"/>
-        <w:gridCol w:w="1070"/>
-        <w:gridCol w:w="1590"/>
-        <w:gridCol w:w="1053"/>
-        <w:gridCol w:w="1561"/>
-        <w:gridCol w:w="1561"/>
-        <w:gridCol w:w="1409"/>
+        <w:gridCol w:w="954"/>
+        <w:gridCol w:w="1377"/>
+        <w:gridCol w:w="1862"/>
+        <w:gridCol w:w="2274"/>
+        <w:gridCol w:w="1023"/>
+        <w:gridCol w:w="1543"/>
+        <w:gridCol w:w="1016"/>
+        <w:gridCol w:w="1487"/>
+        <w:gridCol w:w="1487"/>
+        <w:gridCol w:w="1377"/>
       </w:tblGrid>
       <w:tr>
         <w:tc>
           <w:tcPr>
-            <w:tcW w:type="dxa" w:w="975"/>
+            <w:tcW w:type="dxa" w:w="954"/>
           </w:tcPr>
           <w:p>
             <w:r>
@@ -1417,7 +1417,7 @@
         </w:tc>
         <w:tc>
           <w:tcPr>
-            <w:tcW w:type="dxa" w:w="1409"/>
+            <w:tcW w:type="dxa" w:w="1377"/>
           </w:tcPr>
           <w:p>
             <w:r>
@@ -1430,7 +1430,7 @@
         </w:tc>
         <w:tc>
           <w:tcPr>
-            <w:tcW w:type="dxa" w:w="1393"/>
+            <w:tcW w:type="dxa" w:w="1862"/>
           </w:tcPr>
           <w:p>
             <w:r>
@@ -1443,7 +1443,7 @@
         </w:tc>
         <w:tc>
           <w:tcPr>
-            <w:tcW w:type="dxa" w:w="2379"/>
+            <w:tcW w:type="dxa" w:w="2274"/>
           </w:tcPr>
           <w:p>
             <w:r>
@@ -1456,7 +1456,7 @@
         </w:tc>
         <w:tc>
           <w:tcPr>
-            <w:tcW w:type="dxa" w:w="1070"/>
+            <w:tcW w:type="dxa" w:w="1023"/>
           </w:tcPr>
           <w:p>
             <w:r>
@@ -1469,7 +1469,7 @@
         </w:tc>
         <w:tc>
           <w:tcPr>
-            <w:tcW w:type="dxa" w:w="1590"/>
+            <w:tcW w:type="dxa" w:w="1543"/>
           </w:tcPr>
           <w:p>
             <w:r>
@@ -1482,7 +1482,7 @@
         </w:tc>
         <w:tc>
           <w:tcPr>
-            <w:tcW w:type="dxa" w:w="1053"/>
+            <w:tcW w:type="dxa" w:w="1016"/>
           </w:tcPr>
           <w:p>
             <w:r>
@@ -1495,7 +1495,7 @@
         </w:tc>
         <w:tc>
           <w:tcPr>
-            <w:tcW w:type="dxa" w:w="1561"/>
+            <w:tcW w:type="dxa" w:w="1487"/>
           </w:tcPr>
           <w:p>
             <w:r>
@@ -1508,7 +1508,7 @@
         </w:tc>
         <w:tc>
           <w:tcPr>
-            <w:tcW w:type="dxa" w:w="1561"/>
+            <w:tcW w:type="dxa" w:w="1487"/>
           </w:tcPr>
           <w:p>
             <w:r>
@@ -1521,7 +1521,7 @@
         </w:tc>
         <w:tc>
           <w:tcPr>
-            <w:tcW w:type="dxa" w:w="1409"/>
+            <w:tcW w:type="dxa" w:w="1377"/>
           </w:tcPr>
           <w:p>
             <w:r>
@@ -1536,61 +1536,61 @@
       <w:tr>
         <w:tc>
           <w:tcPr>
-            <w:tcW w:type="dxa" w:w="975"/>
-          </w:tcPr>
-          <w:p/>
-        </w:tc>
-        <w:tc>
-          <w:tcPr>
-            <w:tcW w:type="dxa" w:w="1409"/>
-          </w:tcPr>
-          <w:p/>
-        </w:tc>
-        <w:tc>
-          <w:tcPr>
-            <w:tcW w:type="dxa" w:w="1393"/>
-          </w:tcPr>
-          <w:p/>
-        </w:tc>
-        <w:tc>
-          <w:tcPr>
-            <w:tcW w:type="dxa" w:w="2379"/>
-          </w:tcPr>
-          <w:p/>
-        </w:tc>
-        <w:tc>
-          <w:tcPr>
-            <w:tcW w:type="dxa" w:w="1070"/>
-          </w:tcPr>
-          <w:p/>
-        </w:tc>
-        <w:tc>
-          <w:tcPr>
-            <w:tcW w:type="dxa" w:w="1590"/>
-          </w:tcPr>
-          <w:p/>
-        </w:tc>
-        <w:tc>
-          <w:tcPr>
-            <w:tcW w:type="dxa" w:w="1053"/>
-          </w:tcPr>
-          <w:p/>
-        </w:tc>
-        <w:tc>
-          <w:tcPr>
-            <w:tcW w:type="dxa" w:w="1561"/>
-          </w:tcPr>
-          <w:p/>
-        </w:tc>
-        <w:tc>
-          <w:tcPr>
-            <w:tcW w:type="dxa" w:w="1561"/>
-          </w:tcPr>
-          <w:p/>
-        </w:tc>
-        <w:tc>
-          <w:tcPr>
-            <w:tcW w:type="dxa" w:w="1409"/>
+            <w:tcW w:type="dxa" w:w="954"/>
+          </w:tcPr>
+          <w:p/>
+        </w:tc>
+        <w:tc>
+          <w:tcPr>
+            <w:tcW w:type="dxa" w:w="1377"/>
+          </w:tcPr>
+          <w:p/>
+        </w:tc>
+        <w:tc>
+          <w:tcPr>
+            <w:tcW w:type="dxa" w:w="1862"/>
+          </w:tcPr>
+          <w:p/>
+        </w:tc>
+        <w:tc>
+          <w:tcPr>
+            <w:tcW w:type="dxa" w:w="2274"/>
+          </w:tcPr>
+          <w:p/>
+        </w:tc>
+        <w:tc>
+          <w:tcPr>
+            <w:tcW w:type="dxa" w:w="1023"/>
+          </w:tcPr>
+          <w:p/>
+        </w:tc>
+        <w:tc>
+          <w:tcPr>
+            <w:tcW w:type="dxa" w:w="1543"/>
+          </w:tcPr>
+          <w:p/>
+        </w:tc>
+        <w:tc>
+          <w:tcPr>
+            <w:tcW w:type="dxa" w:w="1016"/>
+          </w:tcPr>
+          <w:p/>
+        </w:tc>
+        <w:tc>
+          <w:tcPr>
+            <w:tcW w:type="dxa" w:w="1487"/>
+          </w:tcPr>
+          <w:p/>
+        </w:tc>
+        <w:tc>
+          <w:tcPr>
+            <w:tcW w:type="dxa" w:w="1487"/>
+          </w:tcPr>
+          <w:p/>
+        </w:tc>
+        <w:tc>
+          <w:tcPr>
+            <w:tcW w:type="dxa" w:w="1377"/>
           </w:tcPr>
           <w:p/>
         </w:tc>
@@ -1598,61 +1598,61 @@
       <w:tr>
         <w:tc>
           <w:tcPr>
-            <w:tcW w:type="dxa" w:w="975"/>
-          </w:tcPr>
-          <w:p/>
-        </w:tc>
-        <w:tc>
-          <w:tcPr>
-            <w:tcW w:type="dxa" w:w="1409"/>
-          </w:tcPr>
-          <w:p/>
-        </w:tc>
-        <w:tc>
-          <w:tcPr>
-            <w:tcW w:type="dxa" w:w="1393"/>
-          </w:tcPr>
-          <w:p/>
-        </w:tc>
-        <w:tc>
-          <w:tcPr>
-            <w:tcW w:type="dxa" w:w="2379"/>
-          </w:tcPr>
-          <w:p/>
-        </w:tc>
-        <w:tc>
-          <w:tcPr>
-            <w:tcW w:type="dxa" w:w="1070"/>
-          </w:tcPr>
-          <w:p/>
-        </w:tc>
-        <w:tc>
-          <w:tcPr>
-            <w:tcW w:type="dxa" w:w="1590"/>
-          </w:tcPr>
-          <w:p/>
-        </w:tc>
-        <w:tc>
-          <w:tcPr>
-            <w:tcW w:type="dxa" w:w="1053"/>
-          </w:tcPr>
-          <w:p/>
-        </w:tc>
-        <w:tc>
-          <w:tcPr>
-            <w:tcW w:type="dxa" w:w="1561"/>
-          </w:tcPr>
-          <w:p/>
-        </w:tc>
-        <w:tc>
-          <w:tcPr>
-            <w:tcW w:type="dxa" w:w="1561"/>
-          </w:tcPr>
-          <w:p/>
-        </w:tc>
-        <w:tc>
-          <w:tcPr>
-            <w:tcW w:type="dxa" w:w="1409"/>
+            <w:tcW w:type="dxa" w:w="954"/>
+          </w:tcPr>
+          <w:p/>
+        </w:tc>
+        <w:tc>
+          <w:tcPr>
+            <w:tcW w:type="dxa" w:w="1377"/>
+          </w:tcPr>
+          <w:p/>
+        </w:tc>
+        <w:tc>
+          <w:tcPr>
+            <w:tcW w:type="dxa" w:w="1862"/>
+          </w:tcPr>
+          <w:p/>
+        </w:tc>
+        <w:tc>
+          <w:tcPr>
+            <w:tcW w:type="dxa" w:w="2274"/>
+          </w:tcPr>
+          <w:p/>
+        </w:tc>
+        <w:tc>
+          <w:tcPr>
+            <w:tcW w:type="dxa" w:w="1023"/>
+          </w:tcPr>
+          <w:p/>
+        </w:tc>
+        <w:tc>
+          <w:tcPr>
+            <w:tcW w:type="dxa" w:w="1543"/>
+          </w:tcPr>
+          <w:p/>
+        </w:tc>
+        <w:tc>
+          <w:tcPr>
+            <w:tcW w:type="dxa" w:w="1016"/>
+          </w:tcPr>
+          <w:p/>
+        </w:tc>
+        <w:tc>
+          <w:tcPr>
+            <w:tcW w:type="dxa" w:w="1487"/>
+          </w:tcPr>
+          <w:p/>
+        </w:tc>
+        <w:tc>
+          <w:tcPr>
+            <w:tcW w:type="dxa" w:w="1487"/>
+          </w:tcPr>
+          <w:p/>
+        </w:tc>
+        <w:tc>
+          <w:tcPr>
+            <w:tcW w:type="dxa" w:w="1377"/>
           </w:tcPr>
           <w:p/>
         </w:tc>
@@ -1660,61 +1660,61 @@
       <w:tr>
         <w:tc>
           <w:tcPr>
-            <w:tcW w:type="dxa" w:w="975"/>
-          </w:tcPr>
-          <w:p/>
-        </w:tc>
-        <w:tc>
-          <w:tcPr>
-            <w:tcW w:type="dxa" w:w="1409"/>
-          </w:tcPr>
-          <w:p/>
-        </w:tc>
-        <w:tc>
-          <w:tcPr>
-            <w:tcW w:type="dxa" w:w="1393"/>
-          </w:tcPr>
-          <w:p/>
-        </w:tc>
-        <w:tc>
-          <w:tcPr>
-            <w:tcW w:type="dxa" w:w="2379"/>
-          </w:tcPr>
-          <w:p/>
-        </w:tc>
-        <w:tc>
-          <w:tcPr>
-            <w:tcW w:type="dxa" w:w="1070"/>
-          </w:tcPr>
-          <w:p/>
-        </w:tc>
-        <w:tc>
-          <w:tcPr>
-            <w:tcW w:type="dxa" w:w="1590"/>
-          </w:tcPr>
-          <w:p/>
-        </w:tc>
-        <w:tc>
-          <w:tcPr>
-            <w:tcW w:type="dxa" w:w="1053"/>
-          </w:tcPr>
-          <w:p/>
-        </w:tc>
-        <w:tc>
-          <w:tcPr>
-            <w:tcW w:type="dxa" w:w="1561"/>
-          </w:tcPr>
-          <w:p/>
-        </w:tc>
-        <w:tc>
-          <w:tcPr>
-            <w:tcW w:type="dxa" w:w="1561"/>
-          </w:tcPr>
-          <w:p/>
-        </w:tc>
-        <w:tc>
-          <w:tcPr>
-            <w:tcW w:type="dxa" w:w="1409"/>
+            <w:tcW w:type="dxa" w:w="954"/>
+          </w:tcPr>
+          <w:p/>
+        </w:tc>
+        <w:tc>
+          <w:tcPr>
+            <w:tcW w:type="dxa" w:w="1377"/>
+          </w:tcPr>
+          <w:p/>
+        </w:tc>
+        <w:tc>
+          <w:tcPr>
+            <w:tcW w:type="dxa" w:w="1862"/>
+          </w:tcPr>
+          <w:p/>
+        </w:tc>
+        <w:tc>
+          <w:tcPr>
+            <w:tcW w:type="dxa" w:w="2274"/>
+          </w:tcPr>
+          <w:p/>
+        </w:tc>
+        <w:tc>
+          <w:tcPr>
+            <w:tcW w:type="dxa" w:w="1023"/>
+          </w:tcPr>
+          <w:p/>
+        </w:tc>
+        <w:tc>
+          <w:tcPr>
+            <w:tcW w:type="dxa" w:w="1543"/>
+          </w:tcPr>
+          <w:p/>
+        </w:tc>
+        <w:tc>
+          <w:tcPr>
+            <w:tcW w:type="dxa" w:w="1016"/>
+          </w:tcPr>
+          <w:p/>
+        </w:tc>
+        <w:tc>
+          <w:tcPr>
+            <w:tcW w:type="dxa" w:w="1487"/>
+          </w:tcPr>
+          <w:p/>
+        </w:tc>
+        <w:tc>
+          <w:tcPr>
+            <w:tcW w:type="dxa" w:w="1487"/>
+          </w:tcPr>
+          <w:p/>
+        </w:tc>
+        <w:tc>
+          <w:tcPr>
+            <w:tcW w:type="dxa" w:w="1377"/>
           </w:tcPr>
           <w:p/>
         </w:tc>
@@ -1722,61 +1722,61 @@
       <w:tr>
         <w:tc>
           <w:tcPr>
-            <w:tcW w:type="dxa" w:w="975"/>
-          </w:tcPr>
-          <w:p/>
-        </w:tc>
-        <w:tc>
-          <w:tcPr>
-            <w:tcW w:type="dxa" w:w="1409"/>
-          </w:tcPr>
-          <w:p/>
-        </w:tc>
-        <w:tc>
-          <w:tcPr>
-            <w:tcW w:type="dxa" w:w="1393"/>
-          </w:tcPr>
-          <w:p/>
-        </w:tc>
-        <w:tc>
-          <w:tcPr>
-            <w:tcW w:type="dxa" w:w="2379"/>
-          </w:tcPr>
-          <w:p/>
-        </w:tc>
-        <w:tc>
-          <w:tcPr>
-            <w:tcW w:type="dxa" w:w="1070"/>
-          </w:tcPr>
-          <w:p/>
-        </w:tc>
-        <w:tc>
-          <w:tcPr>
-            <w:tcW w:type="dxa" w:w="1590"/>
-          </w:tcPr>
-          <w:p/>
-        </w:tc>
-        <w:tc>
-          <w:tcPr>
-            <w:tcW w:type="dxa" w:w="1053"/>
-          </w:tcPr>
-          <w:p/>
-        </w:tc>
-        <w:tc>
-          <w:tcPr>
-            <w:tcW w:type="dxa" w:w="1561"/>
-          </w:tcPr>
-          <w:p/>
-        </w:tc>
-        <w:tc>
-          <w:tcPr>
-            <w:tcW w:type="dxa" w:w="1561"/>
-          </w:tcPr>
-          <w:p/>
-        </w:tc>
-        <w:tc>
-          <w:tcPr>
-            <w:tcW w:type="dxa" w:w="1409"/>
+            <w:tcW w:type="dxa" w:w="954"/>
+          </w:tcPr>
+          <w:p/>
+        </w:tc>
+        <w:tc>
+          <w:tcPr>
+            <w:tcW w:type="dxa" w:w="1377"/>
+          </w:tcPr>
+          <w:p/>
+        </w:tc>
+        <w:tc>
+          <w:tcPr>
+            <w:tcW w:type="dxa" w:w="1862"/>
+          </w:tcPr>
+          <w:p/>
+        </w:tc>
+        <w:tc>
+          <w:tcPr>
+            <w:tcW w:type="dxa" w:w="2274"/>
+          </w:tcPr>
+          <w:p/>
+        </w:tc>
+        <w:tc>
+          <w:tcPr>
+            <w:tcW w:type="dxa" w:w="1023"/>
+          </w:tcPr>
+          <w:p/>
+        </w:tc>
+        <w:tc>
+          <w:tcPr>
+            <w:tcW w:type="dxa" w:w="1543"/>
+          </w:tcPr>
+          <w:p/>
+        </w:tc>
+        <w:tc>
+          <w:tcPr>
+            <w:tcW w:type="dxa" w:w="1016"/>
+          </w:tcPr>
+          <w:p/>
+        </w:tc>
+        <w:tc>
+          <w:tcPr>
+            <w:tcW w:type="dxa" w:w="1487"/>
+          </w:tcPr>
+          <w:p/>
+        </w:tc>
+        <w:tc>
+          <w:tcPr>
+            <w:tcW w:type="dxa" w:w="1487"/>
+          </w:tcPr>
+          <w:p/>
+        </w:tc>
+        <w:tc>
+          <w:tcPr>
+            <w:tcW w:type="dxa" w:w="1377"/>
           </w:tcPr>
           <w:p/>
         </w:tc>
@@ -1784,7 +1784,7 @@
       <w:tr>
         <w:tc>
           <w:tcPr>
-            <w:tcW w:type="dxa" w:w="975"/>
+            <w:tcW w:type="dxa" w:w="954"/>
           </w:tcPr>
           <w:p>
             <w:r>
@@ -1794,7 +1794,7 @@
         </w:tc>
         <w:tc>
           <w:tcPr>
-            <w:tcW w:type="dxa" w:w="1409"/>
+            <w:tcW w:type="dxa" w:w="1377"/>
           </w:tcPr>
           <w:p>
             <w:r>
@@ -1804,7 +1804,7 @@
         </w:tc>
         <w:tc>
           <w:tcPr>
-            <w:tcW w:type="dxa" w:w="1393"/>
+            <w:tcW w:type="dxa" w:w="1862"/>
           </w:tcPr>
           <w:p>
             <w:r>
@@ -1814,7 +1814,7 @@
         </w:tc>
         <w:tc>
           <w:tcPr>
-            <w:tcW w:type="dxa" w:w="2379"/>
+            <w:tcW w:type="dxa" w:w="2274"/>
           </w:tcPr>
           <w:p>
             <w:r>
@@ -1824,7 +1824,7 @@
         </w:tc>
         <w:tc>
           <w:tcPr>
-            <w:tcW w:type="dxa" w:w="1070"/>
+            <w:tcW w:type="dxa" w:w="1023"/>
           </w:tcPr>
           <w:p>
             <w:r>
@@ -1834,7 +1834,7 @@
         </w:tc>
         <w:tc>
           <w:tcPr>
-            <w:tcW w:type="dxa" w:w="1590"/>
+            <w:tcW w:type="dxa" w:w="1543"/>
           </w:tcPr>
           <w:p>
             <w:r>
@@ -1844,7 +1844,7 @@
         </w:tc>
         <w:tc>
           <w:tcPr>
-            <w:tcW w:type="dxa" w:w="1053"/>
+            <w:tcW w:type="dxa" w:w="1016"/>
           </w:tcPr>
           <w:p>
             <w:r>
@@ -1854,7 +1854,7 @@
         </w:tc>
         <w:tc>
           <w:tcPr>
-            <w:tcW w:type="dxa" w:w="1561"/>
+            <w:tcW w:type="dxa" w:w="1487"/>
           </w:tcPr>
           <w:p>
             <w:r>
@@ -1864,7 +1864,7 @@
         </w:tc>
         <w:tc>
           <w:tcPr>
-            <w:tcW w:type="dxa" w:w="1561"/>
+            <w:tcW w:type="dxa" w:w="1487"/>
           </w:tcPr>
           <w:p>
             <w:r>
@@ -1874,7 +1874,7 @@
         </w:tc>
         <w:tc>
           <w:tcPr>
-            <w:tcW w:type="dxa" w:w="1409"/>
+            <w:tcW w:type="dxa" w:w="1377"/>
           </w:tcPr>
           <w:p>
             <w:r>

</xml_diff>